<commit_message>
release: HearthVale v0.1.0 alpha vertical slice
</commit_message>
<xml_diff>
--- a/docs/HearthVale_V1_VS_Implementation_Brief.docx
+++ b/docs/HearthVale_V1_VS_Implementation_Brief.docx
@@ -181,7 +181,7 @@
         <w:pStyle w:val="Callout"/>
       </w:pPr>
       <w:r>
-        <w:t>This document is the bridge from design to code. It defines what Codex or another implementer must build, what data must exist, what state owns each fact, the required resolution order, and how completion is proven.</w:t>
+        <w:t>This document is the bridge from design to code. It defines what an implementer must build, what data must exist, what state owns each fact, the required resolution order, and how completion is proven.</w:t>
       </w:r>
     </w:p>
     <w:p>
@@ -2197,7 +2197,7 @@
     <w:p>
       <w:pPr/>
       <w:r>
-        <w:t>This is a logical contract, not a requirement to rename working repository folders. Codex should map these responsibilities onto the current repository/toolchain instead of rewriting LWE Core for presentation convenience.</w:t>
+        <w:t>This is a logical contract, not a requirement to rename working repository folders. Implementers should map these responsibilities onto the current repository/toolchain instead of rewriting LWE Core for presentation convenience.</w:t>
       </w:r>
     </w:p>
     <w:tbl>
@@ -10122,7 +10122,7 @@
         <w:pStyle w:val="Callout"/>
       </w:pPr>
       <w:r>
-        <w:t>These are the minimum end-to-end proofs for Codex. Unit tests may be more granular, but these behaviors must be demonstrably true before calling the slice playable.</w:t>
+        <w:t>These are the minimum end-to-end implementation proofs. Unit tests may be more granular, but these behaviors must be demonstrably true before calling the slice playable.</w:t>
       </w:r>
     </w:p>
     <w:tbl>
@@ -13156,7 +13156,7 @@
         <w:keepNext/>
       </w:pPr>
       <w:r>
-        <w:t>23. Codex Handoff Instructions</w:t>
+        <w:t>23. Implementation Handoff Instructions</w:t>
       </w:r>
     </w:p>
     <w:p>
@@ -13164,7 +13164,7 @@
         <w:pStyle w:val="Callout"/>
       </w:pPr>
       <w:r>
-        <w:t>Codex should treat Mechanics, Content, Story, UI/UX, this brief, and the current repositories as a contract to implement - not an invitation to redesign HearthVale.</w:t>
+        <w:t>Implementers should treat Mechanics, Content, Story, UI/UX, this brief, and the current repositories as a contract to implement - not an invitation to redesign HearthVale.</w:t>
       </w:r>
     </w:p>
     <w:p>
@@ -13792,7 +13792,7 @@
         <w:pStyle w:val="CompactBullet"/>
       </w:pPr>
       <w:r>
-        <w:t>•  LWE Core repository is available locally to Codex with its tests passing.</w:t>
+        <w:t>•  LWE Core repository is available locally with its tests passing.</w:t>
       </w:r>
     </w:p>
     <w:p>
@@ -13808,7 +13808,7 @@
         <w:pStyle w:val="CompactBullet"/>
       </w:pPr>
       <w:r>
-        <w:t>•  The four specialized V1 VS documents - Mechanics, Content, Story, UI/UX - and this Implementation Brief are placed where Codex can reference them.</w:t>
+        <w:t>•  The four specialized V1 VS documents - Mechanics, Content, Story, UI/UX - and this Implementation Brief are available alongside the repository.</w:t>
       </w:r>
     </w:p>
     <w:p>

</xml_diff>